<commit_message>
Sync GitHub contact and VStudios date
</commit_message>
<xml_diff>
--- a/cuong-dao-cv-2026-full.docx
+++ b/cuong-dao-cv-2026-full.docx
@@ -71,7 +71,7 @@
                 <w:sz w:val="20"/>
                 <w:szCs w:val="20"/>
               </w:rPr>
-              <w:t>Email: dqcuong93@gmail.com | LinkedIn: cuongdao93 | Mobile: +84 902 030 918</w:t>
+              <w:t>Email: dqcuong93@gmail.com | LinkedIn: cuongdao93 | GitHub: dqcuong93 | Mobile: +84 902 030 918</w:t>
             </w:r>
           </w:p>
           <w:p>
@@ -1004,7 +1004,7 @@
           <w:i/>
           <w:szCs w:val="22"/>
         </w:rPr>
-        <w:t>Jul 2020 – Jul 2025</w:t>
+        <w:t>Jul 2020 – Present</w:t>
         <w:br/>
         <w:t xml:space="preserve">Senior Backend developer, full-time </w:t>
       </w:r>

</xml_diff>